<commit_message>
form a b c fixes
</commit_message>
<xml_diff>
--- a/frontend-app/public/documents/PIS_ICF_English.docx
+++ b/frontend-app/public/documents/PIS_ICF_English.docx
@@ -671,7 +671,27 @@
           <w:sz w:val="22"/>
           <w:szCs w:val="22"/>
         </w:rPr>
-        <w:t xml:space="preserve">Your delivery will be attended by senior residents qualified and trained to provide resuscitation. Most of the clinical information will be collected non-invasively and no blood collection is required for the purpose of this trial. Therefore, no extra prick of the baby will be required. All medical records will be treated with the utmost confidentiality and will be revealed only to other doctors involved in the study. The results of this study would be published in a scientific journal/thesis, but you or your child will not be identified by name. A subset of 25% of randomly chosen babies will undergo MRI brain at discharge or at 44 weeks post-menstrual age. The selection of babies for this investigation will be done randomly. MRI brain is a relatively safe investigation and without any ionizing radiation. </w:t>
+        <w:t xml:space="preserve">Your delivery will be attended by senior residents qualified and trained to provide resuscitation. Most of the clinical information will be collected non-invasively and no blood collection is required for the purpose of this trial. Therefore, no extra prick of the baby will be required. All medical records will be treated with the utmost confidentiality and will be revealed only to other doctors involved in the study. The results of this study would be published in a scientific journal/thesis, but you or your child will not be identified by name. A subset of 25% of randomly chosen babies will undergo MRI brain </w:t>
+      </w:r>
+      <w:r>
+        <w:rPr>
+          <w:rFonts w:ascii="Aptos" w:eastAsia="Aptos" w:hAnsi="Aptos" w:cs="Aptos"/>
+          <w:color w:val="000000" w:themeColor="text1"/>
+          <w:sz w:val="22"/>
+          <w:szCs w:val="22"/>
+        </w:rPr>
+        <w:t>between 40 and 44 weeks post-menstrual age.</w:t>
+      </w:r>
+      <w:bookmarkStart w:id="0" w:name="_GoBack"/>
+      <w:bookmarkEnd w:id="0"/>
+      <w:r>
+        <w:rPr>
+          <w:rFonts w:ascii="Aptos" w:eastAsia="Aptos" w:hAnsi="Aptos" w:cs="Aptos"/>
+          <w:color w:val="000000" w:themeColor="text1"/>
+          <w:sz w:val="22"/>
+          <w:szCs w:val="22"/>
+        </w:rPr>
+        <w:t xml:space="preserve"> The selection of babies for this investigation will be done randomly. MRI brain is a relatively safe investigation and without any ionizing radiation. </w:t>
       </w:r>
     </w:p>
     <w:p>
@@ -2515,17 +2535,7 @@
           <w:sz w:val="22"/>
           <w:szCs w:val="22"/>
         </w:rPr>
-        <w:t xml:space="preserve">Signature (or Thumb impression) of the Subject/Legally Acceptable Representative:  </w:t>
-      </w:r>
-      <w:bookmarkStart w:id="0" w:name="_GoBack"/>
-      <w:bookmarkEnd w:id="0"/>
-      <w:r>
-        <w:rPr>
-          <w:rFonts w:ascii="Aptos" w:eastAsia="Aptos" w:hAnsi="Aptos" w:cs="Aptos"/>
-          <w:sz w:val="22"/>
-          <w:szCs w:val="22"/>
-        </w:rPr>
-        <w:t xml:space="preserve">____________  </w:t>
+        <w:t xml:space="preserve">Signature (or Thumb impression) of the Subject/Legally Acceptable Representative:  ____________  </w:t>
       </w:r>
     </w:p>
     <w:p>

</xml_diff>